<commit_message>
Back office et API : fin
</commit_message>
<xml_diff>
--- a/Back-end et cloud/Technologies back-end et Cloud - SmartCity.docx
+++ b/Back-end et cloud/Technologies back-end et Cloud - SmartCity.docx
@@ -501,7 +501,7 @@
               </wp:anchor>
             </w:drawing>
           </mc:Choice>
-          <mc:Fallback xmlns:oel="http://schemas.microsoft.com/office/2019/extlst" xmlns:w16du="http://schemas.microsoft.com/office/word/2023/wordml/word16du">
+          <mc:Fallback xmlns:w16du="http://schemas.microsoft.com/office/word/2023/wordml/word16du" xmlns:oel="http://schemas.microsoft.com/office/2019/extlst">
             <w:pict>
               <v:group w14:anchorId="7E4E8AC4" id="Groupe 3" o:spid="_x0000_s1026" style="position:absolute;margin-left:-73.8pt;margin-top:-73.8pt;width:615pt;height:83.4pt;rotation:180;z-index:251660288;mso-width-relative:margin;mso-height-relative:margin" coordorigin=",16240" coordsize="75596,15749" o:gfxdata="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">
                 <v:shape id="Rectangle 26" o:spid="_x0000_s1027" style="position:absolute;top:20772;width:75596;height:11063;visibility:visible;mso-wrap-style:square;v-text-anchor:middle" coordsize="7559883,1934355" o:gfxdata="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" path="m,701227c587829,573090,933145,739067,1225154,878039v586791,266069,1269349,887391,2332919,822448c5264988,1508883,6226881,333087,7559883,r-2805,1934355l,1934355,,701227xe" fillcolor="#d8d8d8 [2732]" stroked="f" strokeweight="1pt">
@@ -1245,7 +1245,7 @@
               </wp:anchor>
             </w:drawing>
           </mc:Choice>
-          <mc:Fallback xmlns:oel="http://schemas.microsoft.com/office/2019/extlst" xmlns:w16du="http://schemas.microsoft.com/office/word/2023/wordml/word16du">
+          <mc:Fallback xmlns:w16du="http://schemas.microsoft.com/office/word/2023/wordml/word16du" xmlns:oel="http://schemas.microsoft.com/office/2019/extlst">
             <w:pict>
               <v:group w14:anchorId="56E3AE5C" id="Groupe 3" o:spid="_x0000_s1026" style="position:absolute;margin-left:-73.8pt;margin-top:37.9pt;width:615pt;height:169.4pt;z-index:251659264;mso-width-relative:margin;mso-height-relative:margin" coordsize="75598,31989" o:gfxdata="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">
                 <v:shape id="Rectangle 26" o:spid="_x0000_s1027" style="position:absolute;top:12492;width:75598;height:19343;visibility:visible;mso-wrap-style:square;v-text-anchor:middle" coordsize="7559883,1934355" o:gfxdata="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" path="m,701227c587829,573090,933145,739067,1225154,878039v586791,266069,1269349,887391,2332919,822448c5264988,1508883,6226881,333087,7559883,r-2805,1934355l,1934355,,701227xe" fillcolor="#d8d8d8 [2732]" stroked="f" strokeweight="1pt">
@@ -1620,7 +1620,7 @@
         </w:sectPr>
       </w:pPr>
     </w:p>
-    <w:bookmarkStart w:id="0" w:name="_Toc185523251" w:displacedByCustomXml="next"/>
+    <w:bookmarkStart w:id="0" w:name="_Toc185623612" w:displacedByCustomXml="next"/>
     <w:sdt>
       <w:sdtPr>
         <w:rPr>
@@ -1698,7 +1698,7 @@
             </w:rPr>
             <w:fldChar w:fldCharType="separate"/>
           </w:r>
-          <w:hyperlink w:anchor="_Toc185523251" w:history="1">
+          <w:hyperlink w:anchor="_Toc185623612" w:history="1">
             <w:r>
               <w:rPr>
                 <w:rStyle w:val="Hyperlink"/>
@@ -1725,7 +1725,7 @@
                 <w:noProof/>
                 <w:webHidden/>
               </w:rPr>
-              <w:instrText xml:space="preserve"> PAGEREF _Toc185523251 \h </w:instrText>
+              <w:instrText xml:space="preserve"> PAGEREF _Toc185623612 \h </w:instrText>
             </w:r>
             <w:r>
               <w:rPr>
@@ -1776,7 +1776,7 @@
               <w14:ligatures w14:val="none"/>
             </w:rPr>
           </w:pPr>
-          <w:hyperlink w:anchor="_Toc185523252" w:history="1">
+          <w:hyperlink w:anchor="_Toc185623613" w:history="1">
             <w:r>
               <w:rPr>
                 <w:rStyle w:val="Hyperlink"/>
@@ -1825,7 +1825,7 @@
                 <w:noProof/>
                 <w:webHidden/>
               </w:rPr>
-              <w:instrText xml:space="preserve"> PAGEREF _Toc185523252 \h </w:instrText>
+              <w:instrText xml:space="preserve"> PAGEREF _Toc185623613 \h </w:instrText>
             </w:r>
             <w:r>
               <w:rPr>
@@ -1876,7 +1876,7 @@
               <w14:ligatures w14:val="none"/>
             </w:rPr>
           </w:pPr>
-          <w:hyperlink w:anchor="_Toc185523253" w:history="1">
+          <w:hyperlink w:anchor="_Toc185623614" w:history="1">
             <w:r>
               <w:rPr>
                 <w:rStyle w:val="Hyperlink"/>
@@ -1925,7 +1925,7 @@
                 <w:noProof/>
                 <w:webHidden/>
               </w:rPr>
-              <w:instrText xml:space="preserve"> PAGEREF _Toc185523253 \h </w:instrText>
+              <w:instrText xml:space="preserve"> PAGEREF _Toc185623614 \h </w:instrText>
             </w:r>
             <w:r>
               <w:rPr>
@@ -1976,7 +1976,7 @@
               <w14:ligatures w14:val="none"/>
             </w:rPr>
           </w:pPr>
-          <w:hyperlink w:anchor="_Toc185523254" w:history="1">
+          <w:hyperlink w:anchor="_Toc185623615" w:history="1">
             <w:r>
               <w:rPr>
                 <w:rStyle w:val="Hyperlink"/>
@@ -2025,7 +2025,7 @@
                 <w:noProof/>
                 <w:webHidden/>
               </w:rPr>
-              <w:instrText xml:space="preserve"> PAGEREF _Toc185523254 \h </w:instrText>
+              <w:instrText xml:space="preserve"> PAGEREF _Toc185623615 \h </w:instrText>
             </w:r>
             <w:r>
               <w:rPr>
@@ -2076,13 +2076,113 @@
               <w14:ligatures w14:val="none"/>
             </w:rPr>
           </w:pPr>
-          <w:hyperlink w:anchor="_Toc185523255" w:history="1">
+          <w:hyperlink w:anchor="_Toc185623616" w:history="1">
             <w:r>
               <w:rPr>
                 <w:rStyle w:val="Hyperlink"/>
                 <w:noProof/>
               </w:rPr>
               <w:t>4.</w:t>
+            </w:r>
+            <w:r>
+              <w:rPr>
+                <w:rFonts w:cstheme="minorBidi"/>
+                <w:b w:val="0"/>
+                <w:bCs w:val="0"/>
+                <w:caps w:val="0"/>
+                <w:noProof/>
+                <w:kern w:val="0"/>
+                <w:sz w:val="22"/>
+                <w:szCs w:val="22"/>
+                <w:lang w:val="fr-BE" w:eastAsia="fr-BE"/>
+                <w14:ligatures w14:val="none"/>
+              </w:rPr>
+              <w:tab/>
+            </w:r>
+            <w:r>
+              <w:rPr>
+                <w:rStyle w:val="Hyperlink"/>
+                <w:noProof/>
+              </w:rPr>
+              <w:t>Bonus</w:t>
+            </w:r>
+            <w:r>
+              <w:rPr>
+                <w:noProof/>
+                <w:webHidden/>
+              </w:rPr>
+              <w:tab/>
+            </w:r>
+            <w:r>
+              <w:rPr>
+                <w:noProof/>
+                <w:webHidden/>
+              </w:rPr>
+              <w:fldChar w:fldCharType="begin"/>
+            </w:r>
+            <w:r>
+              <w:rPr>
+                <w:noProof/>
+                <w:webHidden/>
+              </w:rPr>
+              <w:instrText xml:space="preserve"> PAGEREF _Toc185623616 \h </w:instrText>
+            </w:r>
+            <w:r>
+              <w:rPr>
+                <w:noProof/>
+                <w:webHidden/>
+              </w:rPr>
+            </w:r>
+            <w:r>
+              <w:rPr>
+                <w:noProof/>
+                <w:webHidden/>
+              </w:rPr>
+              <w:fldChar w:fldCharType="separate"/>
+            </w:r>
+            <w:r>
+              <w:rPr>
+                <w:noProof/>
+                <w:webHidden/>
+              </w:rPr>
+              <w:t>3</w:t>
+            </w:r>
+            <w:r>
+              <w:rPr>
+                <w:noProof/>
+                <w:webHidden/>
+              </w:rPr>
+              <w:fldChar w:fldCharType="end"/>
+            </w:r>
+          </w:hyperlink>
+        </w:p>
+        <w:p>
+          <w:pPr>
+            <w:pStyle w:val="TOC1"/>
+            <w:tabs>
+              <w:tab w:val="left" w:pos="440"/>
+              <w:tab w:val="right" w:leader="dot" w:pos="9350"/>
+            </w:tabs>
+            <w:rPr>
+              <w:rFonts w:cstheme="minorBidi"/>
+              <w:b w:val="0"/>
+              <w:bCs w:val="0"/>
+              <w:caps w:val="0"/>
+              <w:noProof/>
+              <w:kern w:val="0"/>
+              <w:sz w:val="22"/>
+              <w:szCs w:val="22"/>
+              <w:lang w:val="fr-BE" w:eastAsia="fr-BE"/>
+              <w14:ligatures w14:val="none"/>
+            </w:rPr>
+          </w:pPr>
+          <w:hyperlink w:anchor="_Toc185623617" w:history="1">
+            <w:r>
+              <w:rPr>
+                <w:rStyle w:val="Hyperlink"/>
+                <w:noProof/>
+              </w:rPr>
+              <w:t>5.</w:t>
             </w:r>
             <w:r>
               <w:rPr>
@@ -2125,7 +2225,7 @@
                 <w:noProof/>
                 <w:webHidden/>
               </w:rPr>
-              <w:instrText xml:space="preserve"> PAGEREF _Toc185523255 \h </w:instrText>
+              <w:instrText xml:space="preserve"> PAGEREF _Toc185623617 \h </w:instrText>
             </w:r>
             <w:r>
               <w:rPr>
@@ -2145,7 +2245,7 @@
                 <w:noProof/>
                 <w:webHidden/>
               </w:rPr>
-              <w:t>3</w:t>
+              <w:t>4</w:t>
             </w:r>
             <w:r>
               <w:rPr>
@@ -2189,7 +2289,7 @@
       <w:pPr>
         <w:pStyle w:val="Heading1"/>
       </w:pPr>
-      <w:bookmarkStart w:id="1" w:name="_Toc185523252"/>
+      <w:bookmarkStart w:id="1" w:name="_Toc185623613"/>
       <w:r>
         <w:lastRenderedPageBreak/>
         <w:t>Points forts</w:t>
@@ -2351,55 +2451,16 @@
     </w:p>
     <w:p>
       <w:pPr>
-        <w:pStyle w:val="ListParagraph"/>
-        <w:numPr>
-          <w:ilvl w:val="0"/>
-          <w:numId w:val="34"/>
-        </w:numPr>
-        <w:rPr>
-          <w:sz w:val="26"/>
-          <w:szCs w:val="26"/>
-          <w:lang w:val="fr-BE"/>
-        </w:rPr>
-      </w:pPr>
-      <w:r>
-        <w:rPr>
-          <w:sz w:val="26"/>
-          <w:szCs w:val="26"/>
-          <w:lang w:val="fr-BE"/>
-        </w:rPr>
-        <w:t xml:space="preserve">Un fichier comprenant les tests Postman parcourant </w:t>
-      </w:r>
-      <w:r>
-        <w:rPr>
-          <w:sz w:val="26"/>
-          <w:szCs w:val="26"/>
-          <w:u w:val="single"/>
-          <w:lang w:val="fr-BE"/>
-        </w:rPr>
-        <w:t>l’entièreté</w:t>
-      </w:r>
-      <w:r>
-        <w:rPr>
-          <w:sz w:val="26"/>
-          <w:szCs w:val="26"/>
-          <w:lang w:val="fr-BE"/>
-        </w:rPr>
-        <w:t xml:space="preserve"> des routes créées</w:t>
-      </w:r>
+        <w:rPr>
+          <w:lang w:val="fr-BE"/>
+        </w:rPr>
+      </w:pPr>
     </w:p>
     <w:p>
       <w:pPr>
-        <w:rPr>
-          <w:lang w:val="fr-BE"/>
-        </w:rPr>
-      </w:pPr>
-    </w:p>
-    <w:p>
-      <w:pPr>
         <w:pStyle w:val="Heading1"/>
       </w:pPr>
-      <w:bookmarkStart w:id="2" w:name="_Toc185523253"/>
+      <w:bookmarkStart w:id="2" w:name="_Toc185623614"/>
       <w:r>
         <w:t>Points faibles</w:t>
       </w:r>
@@ -2814,7 +2875,7 @@
       <w:pPr>
         <w:pStyle w:val="Heading1"/>
       </w:pPr>
-      <w:bookmarkStart w:id="3" w:name="_Toc185523254"/>
+      <w:bookmarkStart w:id="3" w:name="_Toc185623615"/>
       <w:r>
         <w:t>Améliorations possibles</w:t>
       </w:r>
@@ -3036,6 +3097,7 @@
     </w:p>
     <w:p>
       <w:pPr>
+        <w:pStyle w:val="ListParagraph"/>
         <w:rPr>
           <w:lang w:val="fr-BE"/>
         </w:rPr>
@@ -3045,11 +3107,210 @@
       <w:pPr>
         <w:pStyle w:val="Heading1"/>
       </w:pPr>
-      <w:bookmarkStart w:id="4" w:name="_Toc185523255"/>
+      <w:bookmarkStart w:id="4" w:name="_Toc185623616"/>
       <w:r>
+        <w:t>Bonus</w:t>
+      </w:r>
+      <w:bookmarkEnd w:id="4"/>
+    </w:p>
+    <w:p>
+      <w:pPr>
+        <w:rPr>
+          <w:lang w:val="fr-BE"/>
+        </w:rPr>
+      </w:pPr>
+    </w:p>
+    <w:p>
+      <w:pPr>
+        <w:pStyle w:val="ListParagraph"/>
+        <w:numPr>
+          <w:ilvl w:val="0"/>
+          <w:numId w:val="34"/>
+        </w:numPr>
+        <w:rPr>
+          <w:sz w:val="26"/>
+          <w:szCs w:val="26"/>
+          <w:lang w:val="fr-BE"/>
+        </w:rPr>
+      </w:pPr>
+      <w:r>
+        <w:rPr>
+          <w:sz w:val="26"/>
+          <w:szCs w:val="26"/>
+          <w:lang w:val="fr-BE"/>
+        </w:rPr>
+        <w:t xml:space="preserve">Un fichier comprenant les tests Postman parcourant </w:t>
+      </w:r>
+      <w:r>
+        <w:rPr>
+          <w:sz w:val="26"/>
+          <w:szCs w:val="26"/>
+          <w:u w:val="single"/>
+          <w:lang w:val="fr-BE"/>
+        </w:rPr>
+        <w:t>l’entièreté</w:t>
+      </w:r>
+      <w:r>
+        <w:rPr>
+          <w:sz w:val="26"/>
+          <w:szCs w:val="26"/>
+          <w:lang w:val="fr-BE"/>
+        </w:rPr>
+        <w:t xml:space="preserve"> des routes créées</w:t>
+      </w:r>
+    </w:p>
+    <w:p>
+      <w:pPr>
+        <w:rPr>
+          <w:lang w:val="fr-BE"/>
+        </w:rPr>
+      </w:pPr>
+    </w:p>
+    <w:p>
+      <w:pPr>
+        <w:rPr>
+          <w:lang w:val="fr-BE"/>
+        </w:rPr>
+      </w:pPr>
+    </w:p>
+    <w:p>
+      <w:pPr>
+        <w:rPr>
+          <w:lang w:val="fr-BE"/>
+        </w:rPr>
+      </w:pPr>
+    </w:p>
+    <w:p>
+      <w:pPr>
+        <w:rPr>
+          <w:lang w:val="fr-BE"/>
+        </w:rPr>
+      </w:pPr>
+    </w:p>
+    <w:p>
+      <w:pPr>
+        <w:rPr>
+          <w:lang w:val="fr-BE"/>
+        </w:rPr>
+      </w:pPr>
+    </w:p>
+    <w:p>
+      <w:pPr>
+        <w:rPr>
+          <w:lang w:val="fr-BE"/>
+        </w:rPr>
+      </w:pPr>
+    </w:p>
+    <w:p>
+      <w:pPr>
+        <w:rPr>
+          <w:lang w:val="fr-BE"/>
+        </w:rPr>
+      </w:pPr>
+    </w:p>
+    <w:p>
+      <w:pPr>
+        <w:rPr>
+          <w:lang w:val="fr-BE"/>
+        </w:rPr>
+      </w:pPr>
+    </w:p>
+    <w:p>
+      <w:pPr>
+        <w:rPr>
+          <w:lang w:val="fr-BE"/>
+        </w:rPr>
+      </w:pPr>
+    </w:p>
+    <w:p>
+      <w:pPr>
+        <w:rPr>
+          <w:lang w:val="fr-BE"/>
+        </w:rPr>
+      </w:pPr>
+    </w:p>
+    <w:p>
+      <w:pPr>
+        <w:rPr>
+          <w:lang w:val="fr-BE"/>
+        </w:rPr>
+      </w:pPr>
+    </w:p>
+    <w:p>
+      <w:pPr>
+        <w:rPr>
+          <w:lang w:val="fr-BE"/>
+        </w:rPr>
+      </w:pPr>
+    </w:p>
+    <w:p>
+      <w:pPr>
+        <w:rPr>
+          <w:lang w:val="fr-BE"/>
+        </w:rPr>
+      </w:pPr>
+    </w:p>
+    <w:p>
+      <w:pPr>
+        <w:rPr>
+          <w:lang w:val="fr-BE"/>
+        </w:rPr>
+      </w:pPr>
+    </w:p>
+    <w:p>
+      <w:pPr>
+        <w:rPr>
+          <w:lang w:val="fr-BE"/>
+        </w:rPr>
+      </w:pPr>
+    </w:p>
+    <w:p>
+      <w:pPr>
+        <w:rPr>
+          <w:lang w:val="fr-BE"/>
+        </w:rPr>
+      </w:pPr>
+    </w:p>
+    <w:p>
+      <w:pPr>
+        <w:rPr>
+          <w:lang w:val="fr-BE"/>
+        </w:rPr>
+      </w:pPr>
+    </w:p>
+    <w:p>
+      <w:pPr>
+        <w:rPr>
+          <w:lang w:val="fr-BE"/>
+        </w:rPr>
+      </w:pPr>
+    </w:p>
+    <w:p>
+      <w:pPr>
+        <w:rPr>
+          <w:lang w:val="fr-BE"/>
+        </w:rPr>
+      </w:pPr>
+    </w:p>
+    <w:p>
+      <w:pPr>
+        <w:rPr>
+          <w:lang w:val="fr-BE"/>
+        </w:rPr>
+      </w:pPr>
+    </w:p>
+    <w:p>
+      <w:pPr>
+        <w:pStyle w:val="Heading1"/>
+      </w:pPr>
+      <w:bookmarkStart w:id="5" w:name="_Toc185623488"/>
+      <w:bookmarkStart w:id="6" w:name="_Toc185623617"/>
+      <w:r>
+        <w:lastRenderedPageBreak/>
         <w:t>Modification du schéma de base de données</w:t>
       </w:r>
-      <w:bookmarkEnd w:id="4"/>
+      <w:bookmarkEnd w:id="5"/>
+      <w:bookmarkEnd w:id="6"/>
     </w:p>
     <w:p>
       <w:pPr>
@@ -3082,16 +3343,16 @@
           <w14:ligatures w14:val="none"/>
         </w:rPr>
         <w:drawing>
-          <wp:anchor distT="0" distB="0" distL="114300" distR="114300" simplePos="0" relativeHeight="251661312" behindDoc="0" locked="0" layoutInCell="1" allowOverlap="1" wp14:anchorId="721B7A5F" wp14:editId="2D8DD4C4">
+          <wp:anchor distT="0" distB="0" distL="114300" distR="114300" simplePos="0" relativeHeight="251662336" behindDoc="0" locked="0" layoutInCell="1" allowOverlap="1" wp14:anchorId="49E33AFA" wp14:editId="2D5A70F9">
             <wp:simplePos x="0" y="0"/>
             <wp:positionH relativeFrom="margin">
               <wp:align>center</wp:align>
             </wp:positionH>
             <wp:positionV relativeFrom="paragraph">
-              <wp:posOffset>135890</wp:posOffset>
+              <wp:posOffset>-29845</wp:posOffset>
             </wp:positionV>
-            <wp:extent cx="4114800" cy="6222365"/>
-            <wp:effectExtent l="0" t="0" r="0" b="6985"/>
+            <wp:extent cx="5095875" cy="7703185"/>
+            <wp:effectExtent l="0" t="0" r="9525" b="0"/>
             <wp:wrapSquare wrapText="bothSides"/>
             <wp:docPr id="2" name="Picture 2"/>
             <wp:cNvGraphicFramePr>
@@ -3122,7 +3383,7 @@
                   <pic:spPr bwMode="auto">
                     <a:xfrm>
                       <a:off x="0" y="0"/>
-                      <a:ext cx="4114800" cy="6222365"/>
+                      <a:ext cx="5095875" cy="7703185"/>
                     </a:xfrm>
                     <a:prstGeom prst="rect">
                       <a:avLst/>
@@ -3144,6 +3405,24 @@
           </wp:anchor>
         </w:drawing>
       </w:r>
+    </w:p>
+    <w:p>
+      <w:pPr>
+        <w:pStyle w:val="Heading1"/>
+        <w:numPr>
+          <w:ilvl w:val="0"/>
+          <w:numId w:val="0"/>
+        </w:numPr>
+        <w:ind w:left="360"/>
+        <w:rPr>
+          <w:rFonts w:ascii="Times New Roman" w:eastAsia="Times New Roman" w:hAnsi="Times New Roman" w:cs="Times New Roman"/>
+          <w:kern w:val="0"/>
+          <w:sz w:val="24"/>
+          <w:szCs w:val="24"/>
+          <w:lang w:eastAsia="fr-BE"/>
+          <w14:ligatures w14:val="none"/>
+        </w:rPr>
+      </w:pPr>
     </w:p>
     <w:sectPr>
       <w:pgSz w:w="12240" w:h="15840"/>
@@ -8024,7 +8303,7 @@
   <w:style w:type="paragraph" w:default="1" w:styleId="Normal">
     <w:name w:val="Normal"/>
     <w:qFormat/>
-    <w:rsid w:val="002738A6"/>
+    <w:rsid w:val="002A54AA"/>
     <w:pPr>
       <w:jc w:val="both"/>
     </w:pPr>

</xml_diff>